<commit_message>
docs: update official KHKT 2026 project title across all documentation and word reports
</commit_message>
<xml_diff>
--- a/Huong_dan_su_dung_he_thong_SIMPS.docx
+++ b/Huong_dan_su_dung_he_thong_SIMPS.docx
@@ -24,11 +24,11 @@
         <w:rPr>
           <w:b/>
           <w:color w:val="1E3A8A"/>
-          <w:sz w:val="32"/>
+          <w:sz w:val="28"/>
         </w:rPr>
         <w:t>TÀI LIỆU HƯỚNG DẪN SỬ DỤNG HỆ THỐNG SIMPS</w:t>
         <w:br/>
-        <w:t>(School Incident Management and Prioritization System)</w:t>
+        <w:t>ĐỀ TÀI: NGHIÊN CỨU, PHÁT TRIỂN HỆ THỐNG TIẾP NHẬN VÀ TỰ ĐỘNG XẾP HẠNG ƯU TIÊN XỬ LÝ SỰ CỐ CƠ SỞ VẬT CHẤT TRƯỜNG HỌC DỰA TRÊN THUẬT TOÁN ĐA TIÊU CHÍ (SIMPS)</w:t>
       </w:r>
     </w:p>
     <w:p>

</xml_diff>